<commit_message>
Actualiza sistema de convalidaciones y mejora lectura OCR
</commit_message>
<xml_diff>
--- a/Carreras/Contabilidad y Finanzas/2 años/formato.docx
+++ b/Carreras/Contabilidad y Finanzas/2 años/formato.docx
@@ -13,549 +13,6 @@
         </w:rPr>
       </w:pPr>
     </w:p>
-    <w:tbl>
-      <w:tblPr>
-        <w:tblStyle w:val="TableNormal"/>
-        <w:tblW w:w="0" w:type="auto"/>
-        <w:tblInd w:w="295" w:type="dxa"/>
-        <w:tblBorders>
-          <w:top w:val="single" w:sz="4" w:space="0" w:color="000000"/>
-          <w:left w:val="single" w:sz="4" w:space="0" w:color="000000"/>
-          <w:bottom w:val="single" w:sz="4" w:space="0" w:color="000000"/>
-          <w:right w:val="single" w:sz="4" w:space="0" w:color="000000"/>
-          <w:insideH w:val="single" w:sz="4" w:space="0" w:color="000000"/>
-          <w:insideV w:val="single" w:sz="4" w:space="0" w:color="000000"/>
-        </w:tblBorders>
-        <w:tblLayout w:type="fixed"/>
-        <w:tblLook w:val="01E0" w:firstRow="1" w:lastRow="1" w:firstColumn="1" w:lastColumn="1" w:noHBand="0" w:noVBand="0"/>
-      </w:tblPr>
-      <w:tblGrid>
-        <w:gridCol w:w="1414"/>
-        <w:gridCol w:w="5500"/>
-        <w:gridCol w:w="1448"/>
-        <w:gridCol w:w="1673"/>
-      </w:tblGrid>
-      <w:tr>
-        <w:trPr>
-          <w:trHeight w:val="563"/>
-        </w:trPr>
-        <w:tc>
-          <w:tcPr>
-            <w:tcW w:w="1414" w:type="dxa"/>
-            <w:vMerge w:val="restart"/>
-          </w:tcPr>
-          <w:p>
-            <w:pPr>
-              <w:pStyle w:val="TableParagraph"/>
-              <w:spacing w:before="9"/>
-              <w:rPr>
-                <w:rFonts w:ascii="Times New Roman"/>
-                <w:sz w:val="16"/>
-              </w:rPr>
-            </w:pPr>
-          </w:p>
-          <w:p>
-            <w:pPr>
-              <w:pStyle w:val="TableParagraph"/>
-              <w:ind w:left="277"/>
-              <w:rPr>
-                <w:rFonts w:ascii="Times New Roman"/>
-                <w:sz w:val="20"/>
-              </w:rPr>
-            </w:pPr>
-            <w:r>
-              <w:rPr>
-                <w:rFonts w:ascii="Times New Roman"/>
-                <w:noProof/>
-                <w:sz w:val="20"/>
-              </w:rPr>
-              <w:drawing>
-                <wp:inline distT="0" distB="0" distL="0" distR="0" wp14:anchorId="6440D0DC" wp14:editId="6440D0DD">
-                  <wp:extent cx="531994" cy="592074"/>
-                  <wp:effectExtent l="0" t="0" r="0" b="0"/>
-                  <wp:docPr id="3" name="Image 3"/>
-                  <wp:cNvGraphicFramePr>
-                    <a:graphicFrameLocks xmlns:a="http://schemas.openxmlformats.org/drawingml/2006/main"/>
-                  </wp:cNvGraphicFramePr>
-                  <a:graphic xmlns:a="http://schemas.openxmlformats.org/drawingml/2006/main">
-                    <a:graphicData uri="http://schemas.openxmlformats.org/drawingml/2006/picture">
-                      <pic:pic xmlns:pic="http://schemas.openxmlformats.org/drawingml/2006/picture">
-                        <pic:nvPicPr>
-                          <pic:cNvPr id="3" name="Image 3"/>
-                          <pic:cNvPicPr/>
-                        </pic:nvPicPr>
-                        <pic:blipFill>
-                          <a:blip r:embed="rId6" cstate="print"/>
-                          <a:stretch>
-                            <a:fillRect/>
-                          </a:stretch>
-                        </pic:blipFill>
-                        <pic:spPr>
-                          <a:xfrm>
-                            <a:off x="0" y="0"/>
-                            <a:ext cx="531994" cy="592074"/>
-                          </a:xfrm>
-                          <a:prstGeom prst="rect">
-                            <a:avLst/>
-                          </a:prstGeom>
-                        </pic:spPr>
-                      </pic:pic>
-                    </a:graphicData>
-                  </a:graphic>
-                </wp:inline>
-              </w:drawing>
-            </w:r>
-          </w:p>
-        </w:tc>
-        <w:tc>
-          <w:tcPr>
-            <w:tcW w:w="5500" w:type="dxa"/>
-            <w:vMerge w:val="restart"/>
-          </w:tcPr>
-          <w:p>
-            <w:pPr>
-              <w:pStyle w:val="TableParagraph"/>
-              <w:spacing w:before="155"/>
-              <w:ind w:left="1017" w:hanging="27"/>
-              <w:rPr>
-                <w:rFonts w:ascii="Arial"/>
-                <w:b/>
-                <w:sz w:val="19"/>
-              </w:rPr>
-            </w:pPr>
-            <w:r>
-              <w:rPr>
-                <w:rFonts w:ascii="Arial"/>
-                <w:b/>
-                <w:color w:val="890000"/>
-                <w:sz w:val="19"/>
-              </w:rPr>
-              <w:t>UNIVERSIDAD</w:t>
-            </w:r>
-            <w:r>
-              <w:rPr>
-                <w:rFonts w:ascii="Arial"/>
-                <w:b/>
-                <w:color w:val="890000"/>
-                <w:spacing w:val="-9"/>
-                <w:sz w:val="19"/>
-              </w:rPr>
-              <w:t xml:space="preserve"> </w:t>
-            </w:r>
-            <w:r>
-              <w:rPr>
-                <w:rFonts w:ascii="Arial"/>
-                <w:b/>
-                <w:color w:val="890000"/>
-                <w:sz w:val="19"/>
-              </w:rPr>
-              <w:t>PRIVADA</w:t>
-            </w:r>
-            <w:r>
-              <w:rPr>
-                <w:rFonts w:ascii="Arial"/>
-                <w:b/>
-                <w:color w:val="890000"/>
-                <w:spacing w:val="-9"/>
-                <w:sz w:val="19"/>
-              </w:rPr>
-              <w:t xml:space="preserve"> </w:t>
-            </w:r>
-            <w:r>
-              <w:rPr>
-                <w:rFonts w:ascii="Arial"/>
-                <w:b/>
-                <w:color w:val="890000"/>
-                <w:sz w:val="19"/>
-              </w:rPr>
-              <w:t>DE</w:t>
-            </w:r>
-            <w:r>
-              <w:rPr>
-                <w:rFonts w:ascii="Arial"/>
-                <w:b/>
-                <w:color w:val="890000"/>
-                <w:spacing w:val="-8"/>
-                <w:sz w:val="19"/>
-              </w:rPr>
-              <w:t xml:space="preserve"> </w:t>
-            </w:r>
-            <w:r>
-              <w:rPr>
-                <w:rFonts w:ascii="Arial"/>
-                <w:b/>
-                <w:color w:val="890000"/>
-                <w:spacing w:val="-2"/>
-                <w:sz w:val="19"/>
-              </w:rPr>
-              <w:t>TRUJILLO</w:t>
-            </w:r>
-          </w:p>
-          <w:p>
-            <w:pPr>
-              <w:pStyle w:val="TableParagraph"/>
-              <w:spacing w:before="108" w:line="242" w:lineRule="auto"/>
-              <w:ind w:left="704" w:right="133" w:firstLine="312"/>
-              <w:rPr>
-                <w:rFonts w:ascii="Arial" w:hAnsi="Arial"/>
-                <w:b/>
-                <w:sz w:val="18"/>
-              </w:rPr>
-            </w:pPr>
-            <w:r>
-              <w:rPr>
-                <w:rFonts w:ascii="Arial" w:hAnsi="Arial"/>
-                <w:b/>
-                <w:sz w:val="18"/>
-              </w:rPr>
-              <w:t>CONVALIDACIÓN POR COMPETENCIAS CARRERA</w:t>
-            </w:r>
-            <w:r>
-              <w:rPr>
-                <w:rFonts w:ascii="Arial" w:hAnsi="Arial"/>
-                <w:b/>
-                <w:spacing w:val="-11"/>
-                <w:sz w:val="18"/>
-              </w:rPr>
-              <w:t xml:space="preserve"> </w:t>
-            </w:r>
-            <w:r>
-              <w:rPr>
-                <w:rFonts w:ascii="Arial" w:hAnsi="Arial"/>
-                <w:b/>
-                <w:sz w:val="18"/>
-              </w:rPr>
-              <w:t>PROFESIONAL</w:t>
-            </w:r>
-            <w:r>
-              <w:rPr>
-                <w:rFonts w:ascii="Arial" w:hAnsi="Arial"/>
-                <w:b/>
-                <w:spacing w:val="-10"/>
-                <w:sz w:val="18"/>
-              </w:rPr>
-              <w:t xml:space="preserve"> </w:t>
-            </w:r>
-            <w:r>
-              <w:rPr>
-                <w:rFonts w:ascii="Arial" w:hAnsi="Arial"/>
-                <w:b/>
-                <w:sz w:val="18"/>
-              </w:rPr>
-              <w:t>DE</w:t>
-            </w:r>
-            <w:r>
-              <w:rPr>
-                <w:rFonts w:ascii="Arial" w:hAnsi="Arial"/>
-                <w:b/>
-                <w:spacing w:val="-9"/>
-                <w:sz w:val="18"/>
-              </w:rPr>
-              <w:t xml:space="preserve"> </w:t>
-            </w:r>
-            <w:r>
-              <w:rPr>
-                <w:rFonts w:ascii="Arial" w:hAnsi="Arial"/>
-                <w:b/>
-                <w:sz w:val="18"/>
-              </w:rPr>
-              <w:t>CONTABILIDAD</w:t>
-            </w:r>
-            <w:r>
-              <w:rPr>
-                <w:rFonts w:ascii="Arial" w:hAnsi="Arial"/>
-                <w:b/>
-                <w:spacing w:val="-11"/>
-                <w:sz w:val="18"/>
-              </w:rPr>
-              <w:t xml:space="preserve"> </w:t>
-            </w:r>
-            <w:r>
-              <w:rPr>
-                <w:rFonts w:ascii="Arial" w:hAnsi="Arial"/>
-                <w:b/>
-                <w:sz w:val="18"/>
-              </w:rPr>
-              <w:t>Y</w:t>
-            </w:r>
-          </w:p>
-          <w:p>
-            <w:pPr>
-              <w:pStyle w:val="TableParagraph"/>
-              <w:spacing w:line="204" w:lineRule="exact"/>
-              <w:ind w:left="2068"/>
-              <w:rPr>
-                <w:rFonts w:ascii="Arial" w:hAnsi="Arial"/>
-                <w:b/>
-                <w:sz w:val="18"/>
-              </w:rPr>
-            </w:pPr>
-            <w:r>
-              <w:rPr>
-                <w:rFonts w:ascii="Arial" w:hAnsi="Arial"/>
-                <w:b/>
-                <w:sz w:val="18"/>
-              </w:rPr>
-              <w:t>FINANZAS</w:t>
-            </w:r>
-            <w:r>
-              <w:rPr>
-                <w:rFonts w:ascii="Arial" w:hAnsi="Arial"/>
-                <w:b/>
-                <w:spacing w:val="-4"/>
-                <w:sz w:val="18"/>
-              </w:rPr>
-              <w:t xml:space="preserve"> </w:t>
-            </w:r>
-            <w:r>
-              <w:rPr>
-                <w:rFonts w:ascii="Arial" w:hAnsi="Arial"/>
-                <w:b/>
-                <w:sz w:val="18"/>
-              </w:rPr>
-              <w:t>–</w:t>
-            </w:r>
-            <w:r>
-              <w:rPr>
-                <w:rFonts w:ascii="Arial" w:hAnsi="Arial"/>
-                <w:b/>
-                <w:spacing w:val="-3"/>
-                <w:sz w:val="18"/>
-              </w:rPr>
-              <w:t xml:space="preserve"> </w:t>
-            </w:r>
-            <w:r>
-              <w:rPr>
-                <w:rFonts w:ascii="Arial" w:hAnsi="Arial"/>
-                <w:b/>
-                <w:sz w:val="18"/>
-              </w:rPr>
-              <w:t>2</w:t>
-            </w:r>
-            <w:r>
-              <w:rPr>
-                <w:rFonts w:ascii="Arial" w:hAnsi="Arial"/>
-                <w:b/>
-                <w:spacing w:val="-4"/>
-                <w:sz w:val="18"/>
-              </w:rPr>
-              <w:t xml:space="preserve"> AÑOS</w:t>
-            </w:r>
-          </w:p>
-        </w:tc>
-        <w:tc>
-          <w:tcPr>
-            <w:tcW w:w="1448" w:type="dxa"/>
-          </w:tcPr>
-          <w:p>
-            <w:pPr>
-              <w:pStyle w:val="TableParagraph"/>
-              <w:spacing w:before="172"/>
-              <w:ind w:left="6"/>
-              <w:jc w:val="center"/>
-              <w:rPr>
-                <w:rFonts w:ascii="Arial" w:hAnsi="Arial"/>
-                <w:b/>
-                <w:sz w:val="19"/>
-              </w:rPr>
-            </w:pPr>
-            <w:r>
-              <w:rPr>
-                <w:rFonts w:ascii="Arial" w:hAnsi="Arial"/>
-                <w:b/>
-                <w:spacing w:val="-2"/>
-                <w:sz w:val="19"/>
-              </w:rPr>
-              <w:t>Código:</w:t>
-            </w:r>
-          </w:p>
-        </w:tc>
-        <w:tc>
-          <w:tcPr>
-            <w:tcW w:w="1673" w:type="dxa"/>
-          </w:tcPr>
-          <w:p>
-            <w:pPr>
-              <w:pStyle w:val="TableParagraph"/>
-              <w:spacing w:before="172"/>
-              <w:ind w:left="4"/>
-              <w:jc w:val="center"/>
-              <w:rPr>
-                <w:sz w:val="19"/>
-              </w:rPr>
-            </w:pPr>
-            <w:r>
-              <w:rPr>
-                <w:spacing w:val="-2"/>
-                <w:sz w:val="19"/>
-              </w:rPr>
-              <w:t>FR-VRA-</w:t>
-            </w:r>
-            <w:r>
-              <w:rPr>
-                <w:spacing w:val="-5"/>
-                <w:sz w:val="19"/>
-              </w:rPr>
-              <w:t>166</w:t>
-            </w:r>
-          </w:p>
-        </w:tc>
-      </w:tr>
-      <w:tr>
-        <w:trPr>
-          <w:trHeight w:val="748"/>
-        </w:trPr>
-        <w:tc>
-          <w:tcPr>
-            <w:tcW w:w="1414" w:type="dxa"/>
-            <w:vMerge/>
-            <w:tcBorders>
-              <w:top w:val="nil"/>
-            </w:tcBorders>
-          </w:tcPr>
-          <w:p>
-            <w:pPr>
-              <w:rPr>
-                <w:sz w:val="2"/>
-                <w:szCs w:val="2"/>
-              </w:rPr>
-            </w:pPr>
-          </w:p>
-        </w:tc>
-        <w:tc>
-          <w:tcPr>
-            <w:tcW w:w="5500" w:type="dxa"/>
-            <w:vMerge/>
-            <w:tcBorders>
-              <w:top w:val="nil"/>
-            </w:tcBorders>
-          </w:tcPr>
-          <w:p>
-            <w:pPr>
-              <w:rPr>
-                <w:sz w:val="2"/>
-                <w:szCs w:val="2"/>
-              </w:rPr>
-            </w:pPr>
-          </w:p>
-        </w:tc>
-        <w:tc>
-          <w:tcPr>
-            <w:tcW w:w="1448" w:type="dxa"/>
-          </w:tcPr>
-          <w:p>
-            <w:pPr>
-              <w:pStyle w:val="TableParagraph"/>
-              <w:spacing w:before="47"/>
-              <w:rPr>
-                <w:rFonts w:ascii="Times New Roman"/>
-                <w:sz w:val="19"/>
-              </w:rPr>
-            </w:pPr>
-          </w:p>
-          <w:p>
-            <w:pPr>
-              <w:pStyle w:val="TableParagraph"/>
-              <w:ind w:left="6" w:right="3"/>
-              <w:jc w:val="center"/>
-              <w:rPr>
-                <w:rFonts w:ascii="Arial" w:hAnsi="Arial"/>
-                <w:b/>
-                <w:sz w:val="19"/>
-              </w:rPr>
-            </w:pPr>
-            <w:r>
-              <w:rPr>
-                <w:rFonts w:ascii="Arial" w:hAnsi="Arial"/>
-                <w:b/>
-                <w:spacing w:val="-2"/>
-                <w:sz w:val="19"/>
-              </w:rPr>
-              <w:t>Página:</w:t>
-            </w:r>
-          </w:p>
-        </w:tc>
-        <w:tc>
-          <w:tcPr>
-            <w:tcW w:w="1673" w:type="dxa"/>
-          </w:tcPr>
-          <w:p>
-            <w:pPr>
-              <w:pStyle w:val="TableParagraph"/>
-              <w:spacing w:before="47"/>
-              <w:rPr>
-                <w:rFonts w:ascii="Times New Roman"/>
-                <w:sz w:val="19"/>
-              </w:rPr>
-            </w:pPr>
-          </w:p>
-          <w:p>
-            <w:pPr>
-              <w:pStyle w:val="TableParagraph"/>
-              <w:ind w:left="7"/>
-              <w:jc w:val="center"/>
-              <w:rPr>
-                <w:rFonts w:ascii="Arial" w:hAnsi="Arial"/>
-                <w:b/>
-                <w:sz w:val="19"/>
-              </w:rPr>
-            </w:pPr>
-            <w:r>
-              <w:rPr>
-                <w:sz w:val="19"/>
-              </w:rPr>
-              <w:t>Página</w:t>
-            </w:r>
-            <w:r>
-              <w:rPr>
-                <w:spacing w:val="-3"/>
-                <w:sz w:val="19"/>
-              </w:rPr>
-              <w:t xml:space="preserve"> </w:t>
-            </w:r>
-            <w:r>
-              <w:rPr>
-                <w:rFonts w:ascii="Arial" w:hAnsi="Arial"/>
-                <w:b/>
-                <w:sz w:val="19"/>
-              </w:rPr>
-              <w:t>1</w:t>
-            </w:r>
-            <w:r>
-              <w:rPr>
-                <w:rFonts w:ascii="Arial" w:hAnsi="Arial"/>
-                <w:b/>
-                <w:spacing w:val="-3"/>
-                <w:sz w:val="19"/>
-              </w:rPr>
-              <w:t xml:space="preserve"> </w:t>
-            </w:r>
-            <w:r>
-              <w:rPr>
-                <w:sz w:val="19"/>
-              </w:rPr>
-              <w:t>de</w:t>
-            </w:r>
-            <w:r>
-              <w:rPr>
-                <w:spacing w:val="-3"/>
-                <w:sz w:val="19"/>
-              </w:rPr>
-              <w:t xml:space="preserve"> </w:t>
-            </w:r>
-            <w:r>
-              <w:rPr>
-                <w:rFonts w:ascii="Arial" w:hAnsi="Arial"/>
-                <w:b/>
-                <w:spacing w:val="-10"/>
-                <w:sz w:val="19"/>
-              </w:rPr>
-              <w:t>3</w:t>
-            </w:r>
-          </w:p>
-        </w:tc>
-      </w:tr>
-    </w:tbl>
     <w:p>
       <w:pPr>
         <w:pStyle w:val="Ttulo"/>
@@ -2365,6 +1822,8 @@
       <w:tr>
         <w:trPr>
           <w:trHeight w:val="450"/>
+          <w:tblHeader w:val="true"/>
+          <w:cantSplit/>
         </w:trPr>
         <w:tc>
           <w:tcPr>
@@ -2581,6 +2040,7 @@
       <w:tr>
         <w:trPr>
           <w:trHeight w:val="239"/>
+          <w:cantSplit/>
         </w:trPr>
         <w:tc>
           <w:tcPr>
@@ -2785,6 +2245,7 @@
       <w:tr>
         <w:trPr>
           <w:trHeight w:val="366"/>
+          <w:cantSplit/>
         </w:trPr>
         <w:tc>
           <w:tcPr>
@@ -2971,6 +2432,7 @@
       <w:tr>
         <w:trPr>
           <w:trHeight w:val="239"/>
+          <w:cantSplit/>
         </w:trPr>
         <w:tc>
           <w:tcPr>
@@ -3131,6 +2593,7 @@
       <w:tr>
         <w:trPr>
           <w:trHeight w:val="369"/>
+          <w:cantSplit/>
         </w:trPr>
         <w:tc>
           <w:tcPr>
@@ -3310,6 +2773,7 @@
       <w:tr>
         <w:trPr>
           <w:trHeight w:val="366"/>
+          <w:cantSplit/>
         </w:trPr>
         <w:tc>
           <w:tcPr>
@@ -3489,6 +2953,7 @@
       <w:tr>
         <w:trPr>
           <w:trHeight w:val="369"/>
+          <w:cantSplit/>
         </w:trPr>
         <w:tc>
           <w:tcPr>
@@ -3688,6 +3153,7 @@
       <w:tr>
         <w:trPr>
           <w:trHeight w:val="450"/>
+          <w:cantSplit/>
         </w:trPr>
         <w:tc>
           <w:tcPr>
@@ -3847,6 +3313,7 @@
       <w:tr>
         <w:trPr>
           <w:trHeight w:val="448"/>
+          <w:cantSplit/>
         </w:trPr>
         <w:tc>
           <w:tcPr>
@@ -4019,6 +3486,7 @@
       <w:tr>
         <w:trPr>
           <w:trHeight w:val="369"/>
+          <w:cantSplit/>
         </w:trPr>
         <w:tc>
           <w:tcPr>
@@ -4178,6 +3646,7 @@
       <w:tr>
         <w:trPr>
           <w:trHeight w:val="239"/>
+          <w:cantSplit/>
         </w:trPr>
         <w:tc>
           <w:tcPr>
@@ -4351,6 +3820,7 @@
       <w:tr>
         <w:trPr>
           <w:trHeight w:val="239"/>
+          <w:cantSplit/>
         </w:trPr>
         <w:tc>
           <w:tcPr>
@@ -4567,6 +4037,7 @@
       <w:tr>
         <w:trPr>
           <w:trHeight w:val="369"/>
+          <w:cantSplit/>
         </w:trPr>
         <w:tc>
           <w:tcPr>
@@ -4746,6 +4217,7 @@
       <w:tr>
         <w:trPr>
           <w:trHeight w:val="448"/>
+          <w:cantSplit/>
         </w:trPr>
         <w:tc>
           <w:tcPr>
@@ -4931,6 +4403,7 @@
       <w:tr>
         <w:trPr>
           <w:trHeight w:val="369"/>
+          <w:cantSplit/>
         </w:trPr>
         <w:tc>
           <w:tcPr>
@@ -5143,6 +4616,7 @@
       <w:tr>
         <w:trPr>
           <w:trHeight w:val="239"/>
+          <w:cantSplit/>
         </w:trPr>
         <w:tc>
           <w:tcPr>
@@ -5316,6 +4790,7 @@
       <w:tr>
         <w:trPr>
           <w:trHeight w:val="239"/>
+          <w:cantSplit/>
         </w:trPr>
         <w:tc>
           <w:tcPr>
@@ -5497,6 +4972,7 @@
       <w:tr>
         <w:trPr>
           <w:trHeight w:val="369"/>
+          <w:cantSplit/>
         </w:trPr>
         <w:tc>
           <w:tcPr>
@@ -5676,6 +5152,7 @@
       <w:tr>
         <w:trPr>
           <w:trHeight w:val="369"/>
+          <w:cantSplit/>
         </w:trPr>
         <w:tc>
           <w:tcPr>
@@ -5865,6 +5342,7 @@
       <w:tr>
         <w:trPr>
           <w:trHeight w:val="369"/>
+          <w:cantSplit/>
         </w:trPr>
         <w:tc>
           <w:tcPr>
@@ -6054,6 +5532,7 @@
       <w:tr>
         <w:trPr>
           <w:trHeight w:val="369"/>
+          <w:cantSplit/>
         </w:trPr>
         <w:tc>
           <w:tcPr>
@@ -6243,6 +5722,7 @@
       <w:tr>
         <w:trPr>
           <w:trHeight w:val="369"/>
+          <w:cantSplit/>
         </w:trPr>
         <w:tc>
           <w:tcPr>
@@ -6432,6 +5912,7 @@
       <w:tr>
         <w:trPr>
           <w:trHeight w:val="369"/>
+          <w:cantSplit/>
         </w:trPr>
         <w:tc>
           <w:tcPr>
@@ -6621,6 +6102,7 @@
       <w:tr>
         <w:trPr>
           <w:trHeight w:val="369"/>
+          <w:cantSplit/>
         </w:trPr>
         <w:tc>
           <w:tcPr>
@@ -6810,6 +6292,7 @@
       <w:tr>
         <w:trPr>
           <w:trHeight w:val="369"/>
+          <w:cantSplit/>
         </w:trPr>
         <w:tc>
           <w:tcPr>
@@ -6999,6 +6482,7 @@
       <w:tr>
         <w:trPr>
           <w:trHeight w:val="369"/>
+          <w:cantSplit/>
         </w:trPr>
         <w:tc>
           <w:tcPr>
@@ -7188,6 +6672,7 @@
       <w:tr>
         <w:trPr>
           <w:trHeight w:val="369"/>
+          <w:cantSplit/>
         </w:trPr>
         <w:tc>
           <w:tcPr>
@@ -7379,6 +6864,7 @@
       <w:tr>
         <w:trPr>
           <w:trHeight w:val="369"/>
+          <w:cantSplit/>
         </w:trPr>
         <w:tc>
           <w:tcPr>
@@ -7568,6 +7054,7 @@
       <w:tr>
         <w:trPr>
           <w:trHeight w:val="369"/>
+          <w:cantSplit/>
         </w:trPr>
         <w:tc>
           <w:tcPr>
@@ -7757,6 +7244,7 @@
       <w:tr>
         <w:trPr>
           <w:trHeight w:val="369"/>
+          <w:cantSplit/>
         </w:trPr>
         <w:tc>
           <w:tcPr>
@@ -7946,6 +7434,7 @@
       <w:tr>
         <w:trPr>
           <w:trHeight w:val="369"/>
+          <w:cantSplit/>
         </w:trPr>
         <w:tc>
           <w:tcPr>
@@ -8135,6 +7624,7 @@
       <w:tr>
         <w:trPr>
           <w:trHeight w:val="369"/>
+          <w:cantSplit/>
         </w:trPr>
         <w:tc>
           <w:tcPr>
@@ -8324,6 +7814,7 @@
       <w:tr>
         <w:trPr>
           <w:trHeight w:val="369"/>
+          <w:cantSplit/>
         </w:trPr>
         <w:tc>
           <w:tcPr>
@@ -8513,6 +8004,7 @@
       <w:tr>
         <w:trPr>
           <w:trHeight w:val="369"/>
+          <w:cantSplit/>
         </w:trPr>
         <w:tc>
           <w:tcPr>
@@ -9261,8 +8753,9 @@
           <w:sz w:val="20"/>
         </w:rPr>
         <w:sectPr>
+          <w:headerReference w:type="default" r:id="rId11"/>
           <w:pgSz w:w="11920" w:h="16850"/>
-          <w:pgMar w:top="720" w:right="566" w:bottom="580" w:left="850" w:header="0" w:footer="392" w:gutter="0"/>
+          <w:pgMar w:top="1123" w:right="566" w:bottom="580" w:left="850" w:header="288" w:footer="392" w:gutter="0"/>
           <w:cols w:space="720"/>
         </w:sectPr>
       </w:pPr>
@@ -9349,582 +8842,8 @@
       </w:tblGrid>
       <w:tr>
         <w:trPr>
-          <w:trHeight w:val="553"/>
-        </w:trPr>
-        <w:tc>
-          <w:tcPr>
-            <w:tcW w:w="269" w:type="dxa"/>
-            <w:vMerge w:val="restart"/>
-            <w:tcBorders>
-              <w:top w:val="nil"/>
-              <w:left w:val="nil"/>
-            </w:tcBorders>
-          </w:tcPr>
-          <w:p>
-            <w:pPr>
-              <w:pStyle w:val="TableParagraph"/>
-              <w:rPr>
-                <w:rFonts w:ascii="Times New Roman"/>
-                <w:sz w:val="16"/>
-              </w:rPr>
-            </w:pPr>
-          </w:p>
-        </w:tc>
-        <w:tc>
-          <w:tcPr>
-            <w:tcW w:w="1413" w:type="dxa"/>
-            <w:gridSpan w:val="2"/>
-            <w:vMerge w:val="restart"/>
-            <w:tcBorders>
-              <w:bottom w:val="double" w:sz="4" w:space="0" w:color="000000"/>
-            </w:tcBorders>
-          </w:tcPr>
-          <w:p>
-            <w:pPr>
-              <w:pStyle w:val="TableParagraph"/>
-              <w:spacing w:before="9" w:after="1"/>
-              <w:rPr>
-                <w:rFonts w:ascii="Calibri Light"/>
-                <w:sz w:val="15"/>
-              </w:rPr>
-            </w:pPr>
-          </w:p>
-          <w:p>
-            <w:pPr>
-              <w:pStyle w:val="TableParagraph"/>
-              <w:ind w:left="278"/>
-              <w:rPr>
-                <w:rFonts w:ascii="Calibri Light"/>
-                <w:sz w:val="20"/>
-              </w:rPr>
-            </w:pPr>
-            <w:r>
-              <w:rPr>
-                <w:rFonts w:ascii="Calibri Light"/>
-                <w:noProof/>
-                <w:sz w:val="20"/>
-              </w:rPr>
-              <w:drawing>
-                <wp:inline distT="0" distB="0" distL="0" distR="0" wp14:anchorId="6440D0E4" wp14:editId="6440D0E5">
-                  <wp:extent cx="531994" cy="592074"/>
-                  <wp:effectExtent l="0" t="0" r="0" b="0"/>
-                  <wp:docPr id="7" name="Image 7"/>
-                  <wp:cNvGraphicFramePr>
-                    <a:graphicFrameLocks xmlns:a="http://schemas.openxmlformats.org/drawingml/2006/main"/>
-                  </wp:cNvGraphicFramePr>
-                  <a:graphic xmlns:a="http://schemas.openxmlformats.org/drawingml/2006/main">
-                    <a:graphicData uri="http://schemas.openxmlformats.org/drawingml/2006/picture">
-                      <pic:pic xmlns:pic="http://schemas.openxmlformats.org/drawingml/2006/picture">
-                        <pic:nvPicPr>
-                          <pic:cNvPr id="7" name="Image 7"/>
-                          <pic:cNvPicPr/>
-                        </pic:nvPicPr>
-                        <pic:blipFill>
-                          <a:blip r:embed="rId6" cstate="print"/>
-                          <a:stretch>
-                            <a:fillRect/>
-                          </a:stretch>
-                        </pic:blipFill>
-                        <pic:spPr>
-                          <a:xfrm>
-                            <a:off x="0" y="0"/>
-                            <a:ext cx="531994" cy="592074"/>
-                          </a:xfrm>
-                          <a:prstGeom prst="rect">
-                            <a:avLst/>
-                          </a:prstGeom>
-                        </pic:spPr>
-                      </pic:pic>
-                    </a:graphicData>
-                  </a:graphic>
-                </wp:inline>
-              </w:drawing>
-            </w:r>
-          </w:p>
-        </w:tc>
-        <w:tc>
-          <w:tcPr>
-            <w:tcW w:w="5498" w:type="dxa"/>
-            <w:gridSpan w:val="4"/>
-            <w:vMerge w:val="restart"/>
-            <w:tcBorders>
-              <w:bottom w:val="double" w:sz="4" w:space="0" w:color="000000"/>
-            </w:tcBorders>
-          </w:tcPr>
-          <w:p>
-            <w:pPr>
-              <w:pStyle w:val="TableParagraph"/>
-              <w:spacing w:before="155"/>
-              <w:ind w:left="1018" w:hanging="27"/>
-              <w:rPr>
-                <w:rFonts w:ascii="Arial"/>
-                <w:b/>
-                <w:sz w:val="19"/>
-              </w:rPr>
-            </w:pPr>
-            <w:r>
-              <w:rPr>
-                <w:rFonts w:ascii="Arial"/>
-                <w:b/>
-                <w:color w:val="890000"/>
-                <w:sz w:val="19"/>
-              </w:rPr>
-              <w:t>UNIVERSIDAD</w:t>
-            </w:r>
-            <w:r>
-              <w:rPr>
-                <w:rFonts w:ascii="Arial"/>
-                <w:b/>
-                <w:color w:val="890000"/>
-                <w:spacing w:val="-9"/>
-                <w:sz w:val="19"/>
-              </w:rPr>
-              <w:t xml:space="preserve"> </w:t>
-            </w:r>
-            <w:r>
-              <w:rPr>
-                <w:rFonts w:ascii="Arial"/>
-                <w:b/>
-                <w:color w:val="890000"/>
-                <w:sz w:val="19"/>
-              </w:rPr>
-              <w:t>PRIVADA</w:t>
-            </w:r>
-            <w:r>
-              <w:rPr>
-                <w:rFonts w:ascii="Arial"/>
-                <w:b/>
-                <w:color w:val="890000"/>
-                <w:spacing w:val="-9"/>
-                <w:sz w:val="19"/>
-              </w:rPr>
-              <w:t xml:space="preserve"> </w:t>
-            </w:r>
-            <w:r>
-              <w:rPr>
-                <w:rFonts w:ascii="Arial"/>
-                <w:b/>
-                <w:color w:val="890000"/>
-                <w:sz w:val="19"/>
-              </w:rPr>
-              <w:t>DE</w:t>
-            </w:r>
-            <w:r>
-              <w:rPr>
-                <w:rFonts w:ascii="Arial"/>
-                <w:b/>
-                <w:color w:val="890000"/>
-                <w:spacing w:val="-8"/>
-                <w:sz w:val="19"/>
-              </w:rPr>
-              <w:t xml:space="preserve"> </w:t>
-            </w:r>
-            <w:r>
-              <w:rPr>
-                <w:rFonts w:ascii="Arial"/>
-                <w:b/>
-                <w:color w:val="890000"/>
-                <w:spacing w:val="-2"/>
-                <w:sz w:val="19"/>
-              </w:rPr>
-              <w:t>TRUJILLO</w:t>
-            </w:r>
-          </w:p>
-          <w:p>
-            <w:pPr>
-              <w:pStyle w:val="TableParagraph"/>
-              <w:spacing w:before="108" w:line="242" w:lineRule="auto"/>
-              <w:ind w:left="706" w:right="129" w:firstLine="312"/>
-              <w:rPr>
-                <w:rFonts w:ascii="Arial" w:hAnsi="Arial"/>
-                <w:b/>
-                <w:sz w:val="18"/>
-              </w:rPr>
-            </w:pPr>
-            <w:r>
-              <w:rPr>
-                <w:rFonts w:ascii="Arial" w:hAnsi="Arial"/>
-                <w:b/>
-                <w:sz w:val="18"/>
-              </w:rPr>
-              <w:t>CONVALIDACIÓN POR COMPETENCIAS CARRERA</w:t>
-            </w:r>
-            <w:r>
-              <w:rPr>
-                <w:rFonts w:ascii="Arial" w:hAnsi="Arial"/>
-                <w:b/>
-                <w:spacing w:val="-11"/>
-                <w:sz w:val="18"/>
-              </w:rPr>
-              <w:t xml:space="preserve"> </w:t>
-            </w:r>
-            <w:r>
-              <w:rPr>
-                <w:rFonts w:ascii="Arial" w:hAnsi="Arial"/>
-                <w:b/>
-                <w:sz w:val="18"/>
-              </w:rPr>
-              <w:t>PROFESIONAL</w:t>
-            </w:r>
-            <w:r>
-              <w:rPr>
-                <w:rFonts w:ascii="Arial" w:hAnsi="Arial"/>
-                <w:b/>
-                <w:spacing w:val="-11"/>
-                <w:sz w:val="18"/>
-              </w:rPr>
-              <w:t xml:space="preserve"> </w:t>
-            </w:r>
-            <w:r>
-              <w:rPr>
-                <w:rFonts w:ascii="Arial" w:hAnsi="Arial"/>
-                <w:b/>
-                <w:sz w:val="18"/>
-              </w:rPr>
-              <w:t>DE</w:t>
-            </w:r>
-            <w:r>
-              <w:rPr>
-                <w:rFonts w:ascii="Arial" w:hAnsi="Arial"/>
-                <w:b/>
-                <w:spacing w:val="-9"/>
-                <w:sz w:val="18"/>
-              </w:rPr>
-              <w:t xml:space="preserve"> </w:t>
-            </w:r>
-            <w:r>
-              <w:rPr>
-                <w:rFonts w:ascii="Arial" w:hAnsi="Arial"/>
-                <w:b/>
-                <w:sz w:val="18"/>
-              </w:rPr>
-              <w:t>CONTABILIDAD</w:t>
-            </w:r>
-            <w:r>
-              <w:rPr>
-                <w:rFonts w:ascii="Arial" w:hAnsi="Arial"/>
-                <w:b/>
-                <w:spacing w:val="-11"/>
-                <w:sz w:val="18"/>
-              </w:rPr>
-              <w:t xml:space="preserve"> </w:t>
-            </w:r>
-            <w:r>
-              <w:rPr>
-                <w:rFonts w:ascii="Arial" w:hAnsi="Arial"/>
-                <w:b/>
-                <w:sz w:val="18"/>
-              </w:rPr>
-              <w:t>Y</w:t>
-            </w:r>
-          </w:p>
-          <w:p>
-            <w:pPr>
-              <w:pStyle w:val="TableParagraph"/>
-              <w:spacing w:line="204" w:lineRule="exact"/>
-              <w:ind w:left="2070"/>
-              <w:rPr>
-                <w:rFonts w:ascii="Arial" w:hAnsi="Arial"/>
-                <w:b/>
-                <w:sz w:val="18"/>
-              </w:rPr>
-            </w:pPr>
-            <w:r>
-              <w:rPr>
-                <w:rFonts w:ascii="Arial" w:hAnsi="Arial"/>
-                <w:b/>
-                <w:sz w:val="18"/>
-              </w:rPr>
-              <w:t>FINANZAS</w:t>
-            </w:r>
-            <w:r>
-              <w:rPr>
-                <w:rFonts w:ascii="Arial" w:hAnsi="Arial"/>
-                <w:b/>
-                <w:spacing w:val="-4"/>
-                <w:sz w:val="18"/>
-              </w:rPr>
-              <w:t xml:space="preserve"> </w:t>
-            </w:r>
-            <w:r>
-              <w:rPr>
-                <w:rFonts w:ascii="Arial" w:hAnsi="Arial"/>
-                <w:b/>
-                <w:sz w:val="18"/>
-              </w:rPr>
-              <w:t>–</w:t>
-            </w:r>
-            <w:r>
-              <w:rPr>
-                <w:rFonts w:ascii="Arial" w:hAnsi="Arial"/>
-                <w:b/>
-                <w:spacing w:val="-3"/>
-                <w:sz w:val="18"/>
-              </w:rPr>
-              <w:t xml:space="preserve"> </w:t>
-            </w:r>
-            <w:r>
-              <w:rPr>
-                <w:rFonts w:ascii="Arial" w:hAnsi="Arial"/>
-                <w:b/>
-                <w:sz w:val="18"/>
-              </w:rPr>
-              <w:t>2</w:t>
-            </w:r>
-            <w:r>
-              <w:rPr>
-                <w:rFonts w:ascii="Arial" w:hAnsi="Arial"/>
-                <w:b/>
-                <w:spacing w:val="-4"/>
-                <w:sz w:val="18"/>
-              </w:rPr>
-              <w:t xml:space="preserve"> AÑOS</w:t>
-            </w:r>
-          </w:p>
-        </w:tc>
-        <w:tc>
-          <w:tcPr>
-            <w:tcW w:w="1447" w:type="dxa"/>
-            <w:gridSpan w:val="2"/>
-          </w:tcPr>
-          <w:p>
-            <w:pPr>
-              <w:pStyle w:val="TableParagraph"/>
-              <w:spacing w:before="172"/>
-              <w:ind w:left="367"/>
-              <w:rPr>
-                <w:rFonts w:ascii="Arial" w:hAnsi="Arial"/>
-                <w:b/>
-                <w:sz w:val="19"/>
-              </w:rPr>
-            </w:pPr>
-            <w:r>
-              <w:rPr>
-                <w:rFonts w:ascii="Arial" w:hAnsi="Arial"/>
-                <w:b/>
-                <w:spacing w:val="-2"/>
-                <w:sz w:val="19"/>
-              </w:rPr>
-              <w:t>Código:</w:t>
-            </w:r>
-          </w:p>
-        </w:tc>
-        <w:tc>
-          <w:tcPr>
-            <w:tcW w:w="1696" w:type="dxa"/>
-            <w:gridSpan w:val="2"/>
-          </w:tcPr>
-          <w:p>
-            <w:pPr>
-              <w:pStyle w:val="TableParagraph"/>
-              <w:spacing w:before="172"/>
-              <w:ind w:left="295"/>
-              <w:rPr>
-                <w:sz w:val="19"/>
-              </w:rPr>
-            </w:pPr>
-            <w:r>
-              <w:rPr>
-                <w:spacing w:val="-2"/>
-                <w:sz w:val="19"/>
-              </w:rPr>
-              <w:t>FR-VRA-</w:t>
-            </w:r>
-            <w:r>
-              <w:rPr>
-                <w:spacing w:val="-5"/>
-                <w:sz w:val="19"/>
-              </w:rPr>
-              <w:t>166</w:t>
-            </w:r>
-          </w:p>
-        </w:tc>
-      </w:tr>
-      <w:tr>
-        <w:trPr>
-          <w:trHeight w:val="751"/>
-        </w:trPr>
-        <w:tc>
-          <w:tcPr>
-            <w:tcW w:w="269" w:type="dxa"/>
-            <w:vMerge/>
-            <w:tcBorders>
-              <w:top w:val="nil"/>
-              <w:left w:val="nil"/>
-            </w:tcBorders>
-          </w:tcPr>
-          <w:p>
-            <w:pPr>
-              <w:rPr>
-                <w:sz w:val="2"/>
-                <w:szCs w:val="2"/>
-              </w:rPr>
-            </w:pPr>
-          </w:p>
-        </w:tc>
-        <w:tc>
-          <w:tcPr>
-            <w:tcW w:w="1413" w:type="dxa"/>
-            <w:gridSpan w:val="2"/>
-            <w:vMerge/>
-            <w:tcBorders>
-              <w:top w:val="nil"/>
-              <w:bottom w:val="double" w:sz="4" w:space="0" w:color="000000"/>
-            </w:tcBorders>
-          </w:tcPr>
-          <w:p>
-            <w:pPr>
-              <w:rPr>
-                <w:sz w:val="2"/>
-                <w:szCs w:val="2"/>
-              </w:rPr>
-            </w:pPr>
-          </w:p>
-        </w:tc>
-        <w:tc>
-          <w:tcPr>
-            <w:tcW w:w="5498" w:type="dxa"/>
-            <w:gridSpan w:val="4"/>
-            <w:vMerge/>
-            <w:tcBorders>
-              <w:top w:val="nil"/>
-              <w:bottom w:val="double" w:sz="4" w:space="0" w:color="000000"/>
-            </w:tcBorders>
-          </w:tcPr>
-          <w:p>
-            <w:pPr>
-              <w:rPr>
-                <w:sz w:val="2"/>
-                <w:szCs w:val="2"/>
-              </w:rPr>
-            </w:pPr>
-          </w:p>
-        </w:tc>
-        <w:tc>
-          <w:tcPr>
-            <w:tcW w:w="1447" w:type="dxa"/>
-            <w:gridSpan w:val="2"/>
-            <w:tcBorders>
-              <w:bottom w:val="double" w:sz="4" w:space="0" w:color="000000"/>
-            </w:tcBorders>
-          </w:tcPr>
-          <w:p>
-            <w:pPr>
-              <w:pStyle w:val="TableParagraph"/>
-              <w:spacing w:before="24"/>
-              <w:rPr>
-                <w:rFonts w:ascii="Calibri Light"/>
-                <w:sz w:val="19"/>
-              </w:rPr>
-            </w:pPr>
-          </w:p>
-          <w:p>
-            <w:pPr>
-              <w:pStyle w:val="TableParagraph"/>
-              <w:ind w:left="381"/>
-              <w:rPr>
-                <w:rFonts w:ascii="Arial" w:hAnsi="Arial"/>
-                <w:b/>
-                <w:sz w:val="19"/>
-              </w:rPr>
-            </w:pPr>
-            <w:r>
-              <w:rPr>
-                <w:rFonts w:ascii="Arial" w:hAnsi="Arial"/>
-                <w:b/>
-                <w:spacing w:val="-2"/>
-                <w:sz w:val="19"/>
-              </w:rPr>
-              <w:t>Página:</w:t>
-            </w:r>
-          </w:p>
-        </w:tc>
-        <w:tc>
-          <w:tcPr>
-            <w:tcW w:w="1696" w:type="dxa"/>
-            <w:gridSpan w:val="2"/>
-            <w:tcBorders>
-              <w:bottom w:val="double" w:sz="4" w:space="0" w:color="000000"/>
-            </w:tcBorders>
-          </w:tcPr>
-          <w:p>
-            <w:pPr>
-              <w:pStyle w:val="TableParagraph"/>
-              <w:spacing w:before="24"/>
-              <w:rPr>
-                <w:rFonts w:ascii="Calibri Light"/>
-                <w:sz w:val="19"/>
-              </w:rPr>
-            </w:pPr>
-          </w:p>
-          <w:p>
-            <w:pPr>
-              <w:pStyle w:val="TableParagraph"/>
-              <w:ind w:left="252"/>
-              <w:rPr>
-                <w:rFonts w:ascii="Arial" w:hAnsi="Arial"/>
-                <w:b/>
-                <w:sz w:val="19"/>
-              </w:rPr>
-            </w:pPr>
-            <w:r>
-              <w:rPr>
-                <w:sz w:val="19"/>
-              </w:rPr>
-              <w:t>Página</w:t>
-            </w:r>
-            <w:r>
-              <w:rPr>
-                <w:spacing w:val="-3"/>
-                <w:sz w:val="19"/>
-              </w:rPr>
-              <w:t xml:space="preserve"> </w:t>
-            </w:r>
-            <w:r>
-              <w:rPr>
-                <w:rFonts w:ascii="Arial" w:hAnsi="Arial"/>
-                <w:b/>
-                <w:sz w:val="19"/>
-              </w:rPr>
-              <w:t>3</w:t>
-            </w:r>
-            <w:r>
-              <w:rPr>
-                <w:rFonts w:ascii="Arial" w:hAnsi="Arial"/>
-                <w:b/>
-                <w:spacing w:val="-3"/>
-                <w:sz w:val="19"/>
-              </w:rPr>
-              <w:t xml:space="preserve"> </w:t>
-            </w:r>
-            <w:r>
-              <w:rPr>
-                <w:sz w:val="19"/>
-              </w:rPr>
-              <w:t>de</w:t>
-            </w:r>
-            <w:r>
-              <w:rPr>
-                <w:spacing w:val="-3"/>
-                <w:sz w:val="19"/>
-              </w:rPr>
-              <w:t xml:space="preserve"> </w:t>
-            </w:r>
-            <w:r>
-              <w:rPr>
-                <w:rFonts w:ascii="Arial" w:hAnsi="Arial"/>
-                <w:b/>
-                <w:spacing w:val="-10"/>
-                <w:sz w:val="19"/>
-              </w:rPr>
-              <w:t>3</w:t>
-            </w:r>
-          </w:p>
-        </w:tc>
-      </w:tr>
-      <w:tr>
-        <w:trPr>
           <w:trHeight w:val="269"/>
+          <w:cantSplit/>
         </w:trPr>
         <w:tc>
           <w:tcPr>
@@ -10132,6 +9051,7 @@
       <w:tr>
         <w:trPr>
           <w:trHeight w:val="719"/>
+          <w:cantSplit/>
         </w:trPr>
         <w:tc>
           <w:tcPr>
@@ -10409,6 +9329,7 @@
       <w:tr>
         <w:trPr>
           <w:trHeight w:val="225"/>
+          <w:cantSplit/>
         </w:trPr>
         <w:tc>
           <w:tcPr>
@@ -10648,6 +9569,7 @@
       <w:tr>
         <w:trPr>
           <w:trHeight w:val="225"/>
+          <w:cantSplit/>
         </w:trPr>
         <w:tc>
           <w:tcPr>
@@ -10871,6 +9793,7 @@
       <w:tr>
         <w:trPr>
           <w:trHeight w:val="225"/>
+          <w:cantSplit/>
         </w:trPr>
         <w:tc>
           <w:tcPr>
@@ -11055,6 +9978,7 @@
       <w:tr>
         <w:trPr>
           <w:trHeight w:val="448"/>
+          <w:cantSplit/>
         </w:trPr>
         <w:tc>
           <w:tcPr>
@@ -11290,6 +10214,7 @@
       <w:tr>
         <w:trPr>
           <w:trHeight w:val="369"/>
+          <w:cantSplit/>
         </w:trPr>
         <w:tc>
           <w:tcPr>
@@ -11525,6 +10450,7 @@
       <w:tr>
         <w:trPr>
           <w:trHeight w:val="367"/>
+          <w:cantSplit/>
         </w:trPr>
         <w:tc>
           <w:tcPr>
@@ -11728,6 +10654,7 @@
       <w:tr>
         <w:trPr>
           <w:trHeight w:val="225"/>
+          <w:cantSplit/>
         </w:trPr>
         <w:tc>
           <w:tcPr>
@@ -11971,6 +10898,7 @@
       <w:tr>
         <w:trPr>
           <w:trHeight w:val="225"/>
+          <w:cantSplit/>
         </w:trPr>
         <w:tc>
           <w:tcPr>
@@ -12193,6 +11121,7 @@
       <w:tr>
         <w:trPr>
           <w:trHeight w:val="225"/>
+          <w:cantSplit/>
         </w:trPr>
         <w:tc>
           <w:tcPr>
@@ -12401,6 +11330,7 @@
       <w:tr>
         <w:trPr>
           <w:trHeight w:val="366"/>
+          <w:cantSplit/>
         </w:trPr>
         <w:tc>
           <w:tcPr>
@@ -12622,6 +11552,7 @@
       <w:tr>
         <w:trPr>
           <w:trHeight w:val="225"/>
+          <w:cantSplit/>
         </w:trPr>
         <w:tc>
           <w:tcPr>
@@ -12843,6 +11774,7 @@
       <w:tr>
         <w:trPr>
           <w:trHeight w:val="225"/>
+          <w:cantSplit/>
         </w:trPr>
         <w:tc>
           <w:tcPr>
@@ -13051,6 +11983,7 @@
       <w:tr>
         <w:trPr>
           <w:trHeight w:val="369"/>
+          <w:cantSplit/>
         </w:trPr>
         <w:tc>
           <w:tcPr>
@@ -13289,6 +12222,7 @@
       <w:tr>
         <w:trPr>
           <w:trHeight w:val="225"/>
+          <w:cantSplit/>
         </w:trPr>
         <w:tc>
           <w:tcPr>
@@ -13498,6 +12432,7 @@
       <w:tr>
         <w:trPr>
           <w:trHeight w:val="225"/>
+          <w:cantSplit/>
         </w:trPr>
         <w:tc>
           <w:tcPr>
@@ -13707,6 +12642,7 @@
       <w:tr>
         <w:trPr>
           <w:trHeight w:val="366"/>
+          <w:cantSplit/>
         </w:trPr>
         <w:tc>
           <w:tcPr>
@@ -13950,6 +12886,7 @@
       <w:tr>
         <w:trPr>
           <w:trHeight w:val="551"/>
+          <w:cantSplit/>
         </w:trPr>
         <w:tc>
           <w:tcPr>
@@ -14175,6 +13112,7 @@
       <w:tr>
         <w:trPr>
           <w:trHeight w:val="225"/>
+          <w:cantSplit/>
         </w:trPr>
         <w:tc>
           <w:tcPr>
@@ -14391,6 +13329,7 @@
       <w:tr>
         <w:trPr>
           <w:trHeight w:val="225"/>
+          <w:cantSplit/>
         </w:trPr>
         <w:tc>
           <w:tcPr>
@@ -14657,6 +13596,7 @@
       <w:tr>
         <w:trPr>
           <w:trHeight w:val="369"/>
+          <w:cantSplit/>
         </w:trPr>
         <w:tc>
           <w:tcPr>
@@ -14877,6 +13817,7 @@
       <w:tr>
         <w:trPr>
           <w:trHeight w:val="222"/>
+          <w:cantSplit/>
         </w:trPr>
         <w:tc>
           <w:tcPr>
@@ -15086,6 +14027,7 @@
       <w:tr>
         <w:trPr>
           <w:trHeight w:val="225"/>
+          <w:cantSplit/>
         </w:trPr>
         <w:tc>
           <w:tcPr>
@@ -15294,6 +14236,7 @@
       <w:tr>
         <w:trPr>
           <w:trHeight w:val="736"/>
+          <w:cantSplit/>
         </w:trPr>
         <w:tc>
           <w:tcPr>
@@ -15597,6 +14540,7 @@
       <w:tr>
         <w:trPr>
           <w:trHeight w:val="225"/>
+          <w:cantSplit/>
         </w:trPr>
         <w:tc>
           <w:tcPr>
@@ -15818,6 +14762,7 @@
       <w:tr>
         <w:trPr>
           <w:trHeight w:val="369"/>
+          <w:cantSplit/>
         </w:trPr>
         <w:tc>
           <w:tcPr>
@@ -16048,6 +14993,7 @@
       <w:tr>
         <w:trPr>
           <w:trHeight w:val="225"/>
+          <w:cantSplit/>
         </w:trPr>
         <w:tc>
           <w:tcPr>
@@ -16281,6 +15227,7 @@
       <w:tr>
         <w:trPr>
           <w:trHeight w:val="223"/>
+          <w:cantSplit/>
         </w:trPr>
         <w:tc>
           <w:tcPr>
@@ -16502,6 +15449,7 @@
       <w:tr>
         <w:trPr>
           <w:trHeight w:val="227"/>
+          <w:cantSplit/>
         </w:trPr>
         <w:tc>
           <w:tcPr>
@@ -16601,8 +15549,9 @@
     </w:tbl>
     <w:p/>
     <w:sectPr>
+      <w:headerReference w:type="default" r:id="rId12"/>
       <w:pgSz w:w="11920" w:h="16850"/>
-      <w:pgMar w:top="720" w:right="566" w:bottom="580" w:left="850" w:header="0" w:footer="392" w:gutter="0"/>
+      <w:pgMar w:top="1123" w:right="566" w:bottom="580" w:left="850" w:header="288" w:footer="392" w:gutter="0"/>
       <w:cols w:space="720"/>
     </w:sectPr>
   </w:body>
@@ -17201,6 +16150,996 @@
     </w:p>
   </w:footnote>
 </w:footnotes>
+</file>
+
+<file path=word/header1.xml><?xml version="1.0" encoding="utf-8"?>
+<w:hdr xmlns:m="http://schemas.openxmlformats.org/officeDocument/2006/math" xmlns:mc="http://schemas.openxmlformats.org/markup-compatibility/2006" xmlns:mo="http://schemas.microsoft.com/office/mac/office/2008/main" xmlns:mv="urn:schemas-microsoft-com:mac:vml" xmlns:o="urn:schemas-microsoft-com:office:office" xmlns:r="http://schemas.openxmlformats.org/officeDocument/2006/relationships" xmlns:v="urn:schemas-microsoft-com:vml" xmlns:w10="urn:schemas-microsoft-com:office:word" xmlns:w14="http://schemas.microsoft.com/office/word/2010/wordml" xmlns:w="http://schemas.openxmlformats.org/wordprocessingml/2006/main" xmlns:wne="http://schemas.microsoft.com/office/word/2006/wordml" xmlns:wp14="http://schemas.microsoft.com/office/word/2010/wordprocessingDrawing" xmlns:wp="http://schemas.openxmlformats.org/drawingml/2006/wordprocessingDrawing" xmlns:wpc="http://schemas.microsoft.com/office/word/2010/wordprocessingCanvas" xmlns:wpg="http://schemas.microsoft.com/office/word/2010/wordprocessingGroup" xmlns:wpi="http://schemas.microsoft.com/office/word/2010/wordprocessingInk" xmlns:wps="http://schemas.microsoft.com/office/word/2010/wordprocessingShape" mc:Ignorable="w14 wp14">
+  <w:p>
+    <w:pPr>
+      <w:pStyle w:val="Header"/>
+    </w:pPr>
+  </w:p>
+  <w:tbl>
+    <w:tblPr>
+      <w:tblStyle w:val="TableNormal"/>
+      <w:tblW w:w="0" w:type="auto"/>
+      <w:tblInd w:w="295" w:type="dxa"/>
+      <w:tblBorders>
+        <w:top w:val="single" w:sz="4" w:space="0" w:color="000000"/>
+        <w:left w:val="single" w:sz="4" w:space="0" w:color="000000"/>
+        <w:bottom w:val="single" w:sz="4" w:space="0" w:color="000000"/>
+        <w:right w:val="single" w:sz="4" w:space="0" w:color="000000"/>
+        <w:insideH w:val="single" w:sz="4" w:space="0" w:color="000000"/>
+        <w:insideV w:val="single" w:sz="4" w:space="0" w:color="000000"/>
+      </w:tblBorders>
+      <w:tblLayout w:type="fixed"/>
+      <w:tblLook w:val="01E0" w:firstRow="1" w:lastRow="1" w:firstColumn="1" w:lastColumn="1" w:noHBand="0" w:noVBand="0"/>
+    </w:tblPr>
+    <w:tblGrid>
+      <w:gridCol w:w="1414"/>
+      <w:gridCol w:w="5500"/>
+      <w:gridCol w:w="1448"/>
+      <w:gridCol w:w="1673"/>
+    </w:tblGrid>
+    <w:tr>
+      <w:trPr>
+        <w:trHeight w:val="563"/>
+      </w:trPr>
+      <w:tc>
+        <w:tcPr>
+          <w:tcW w:w="1414" w:type="dxa"/>
+          <w:vMerge w:val="restart"/>
+        </w:tcPr>
+        <w:p>
+          <w:pPr>
+            <w:pStyle w:val="TableParagraph"/>
+            <w:spacing w:before="9"/>
+            <w:rPr>
+              <w:rFonts w:ascii="Times New Roman"/>
+              <w:sz w:val="16"/>
+            </w:rPr>
+          </w:pPr>
+        </w:p>
+        <w:p>
+          <w:pPr>
+            <w:pStyle w:val="TableParagraph"/>
+            <w:ind w:left="277"/>
+            <w:rPr>
+              <w:rFonts w:ascii="Times New Roman"/>
+              <w:sz w:val="20"/>
+            </w:rPr>
+          </w:pPr>
+          <w:r>
+            <w:rPr>
+              <w:rFonts w:ascii="Times New Roman"/>
+              <w:noProof/>
+              <w:sz w:val="20"/>
+            </w:rPr>
+            <w:drawing>
+              <wp:inline distT="0" distB="0" distL="0" distR="0" wp14:anchorId="6440D0DC" wp14:editId="6440D0DD">
+                <wp:extent cx="531994" cy="592074"/>
+                <wp:effectExtent l="0" t="0" r="0" b="0"/>
+                <wp:docPr id="3" name="Image 3"/>
+                <wp:cNvGraphicFramePr>
+                  <a:graphicFrameLocks xmlns:a="http://schemas.openxmlformats.org/drawingml/2006/main"/>
+                </wp:cNvGraphicFramePr>
+                <a:graphic xmlns:a="http://schemas.openxmlformats.org/drawingml/2006/main">
+                  <a:graphicData uri="http://schemas.openxmlformats.org/drawingml/2006/picture">
+                    <pic:pic xmlns:pic="http://schemas.openxmlformats.org/drawingml/2006/picture">
+                      <pic:nvPicPr>
+                        <pic:cNvPr id="3" name="Image 3"/>
+                        <pic:cNvPicPr/>
+                      </pic:nvPicPr>
+                      <pic:blipFill>
+                        <a:blip r:embed="rId1" cstate="print"/>
+                        <a:stretch>
+                          <a:fillRect/>
+                        </a:stretch>
+                      </pic:blipFill>
+                      <pic:spPr>
+                        <a:xfrm>
+                          <a:off x="0" y="0"/>
+                          <a:ext cx="531994" cy="592074"/>
+                        </a:xfrm>
+                        <a:prstGeom prst="rect">
+                          <a:avLst/>
+                        </a:prstGeom>
+                      </pic:spPr>
+                    </pic:pic>
+                  </a:graphicData>
+                </a:graphic>
+              </wp:inline>
+            </w:drawing>
+          </w:r>
+        </w:p>
+      </w:tc>
+      <w:tc>
+        <w:tcPr>
+          <w:tcW w:w="5500" w:type="dxa"/>
+          <w:vMerge w:val="restart"/>
+        </w:tcPr>
+        <w:p>
+          <w:pPr>
+            <w:pStyle w:val="TableParagraph"/>
+            <w:spacing w:before="155"/>
+            <w:ind w:left="1017" w:hanging="27"/>
+            <w:rPr>
+              <w:rFonts w:ascii="Arial"/>
+              <w:b/>
+              <w:sz w:val="19"/>
+            </w:rPr>
+          </w:pPr>
+          <w:r>
+            <w:rPr>
+              <w:rFonts w:ascii="Arial"/>
+              <w:b/>
+              <w:color w:val="890000"/>
+              <w:sz w:val="19"/>
+            </w:rPr>
+            <w:t>UNIVERSIDAD</w:t>
+          </w:r>
+          <w:r>
+            <w:rPr>
+              <w:rFonts w:ascii="Arial"/>
+              <w:b/>
+              <w:color w:val="890000"/>
+              <w:spacing w:val="-9"/>
+              <w:sz w:val="19"/>
+            </w:rPr>
+            <w:t xml:space="preserve"> </w:t>
+          </w:r>
+          <w:r>
+            <w:rPr>
+              <w:rFonts w:ascii="Arial"/>
+              <w:b/>
+              <w:color w:val="890000"/>
+              <w:sz w:val="19"/>
+            </w:rPr>
+            <w:t>PRIVADA</w:t>
+          </w:r>
+          <w:r>
+            <w:rPr>
+              <w:rFonts w:ascii="Arial"/>
+              <w:b/>
+              <w:color w:val="890000"/>
+              <w:spacing w:val="-9"/>
+              <w:sz w:val="19"/>
+            </w:rPr>
+            <w:t xml:space="preserve"> </w:t>
+          </w:r>
+          <w:r>
+            <w:rPr>
+              <w:rFonts w:ascii="Arial"/>
+              <w:b/>
+              <w:color w:val="890000"/>
+              <w:sz w:val="19"/>
+            </w:rPr>
+            <w:t>DE</w:t>
+          </w:r>
+          <w:r>
+            <w:rPr>
+              <w:rFonts w:ascii="Arial"/>
+              <w:b/>
+              <w:color w:val="890000"/>
+              <w:spacing w:val="-8"/>
+              <w:sz w:val="19"/>
+            </w:rPr>
+            <w:t xml:space="preserve"> </w:t>
+          </w:r>
+          <w:r>
+            <w:rPr>
+              <w:rFonts w:ascii="Arial"/>
+              <w:b/>
+              <w:color w:val="890000"/>
+              <w:spacing w:val="-2"/>
+              <w:sz w:val="19"/>
+            </w:rPr>
+            <w:t>TRUJILLO</w:t>
+          </w:r>
+        </w:p>
+        <w:p>
+          <w:pPr>
+            <w:pStyle w:val="TableParagraph"/>
+            <w:spacing w:before="108" w:line="242" w:lineRule="auto"/>
+            <w:ind w:left="704" w:right="133" w:firstLine="312"/>
+            <w:rPr>
+              <w:rFonts w:ascii="Arial" w:hAnsi="Arial"/>
+              <w:b/>
+              <w:sz w:val="18"/>
+            </w:rPr>
+          </w:pPr>
+          <w:r>
+            <w:rPr>
+              <w:rFonts w:ascii="Arial" w:hAnsi="Arial"/>
+              <w:b/>
+              <w:sz w:val="18"/>
+            </w:rPr>
+            <w:t>CONVALIDACIÓN POR COMPETENCIAS CARRERA</w:t>
+          </w:r>
+          <w:r>
+            <w:rPr>
+              <w:rFonts w:ascii="Arial" w:hAnsi="Arial"/>
+              <w:b/>
+              <w:spacing w:val="-11"/>
+              <w:sz w:val="18"/>
+            </w:rPr>
+            <w:t xml:space="preserve"> </w:t>
+          </w:r>
+          <w:r>
+            <w:rPr>
+              <w:rFonts w:ascii="Arial" w:hAnsi="Arial"/>
+              <w:b/>
+              <w:sz w:val="18"/>
+            </w:rPr>
+            <w:t>PROFESIONAL</w:t>
+          </w:r>
+          <w:r>
+            <w:rPr>
+              <w:rFonts w:ascii="Arial" w:hAnsi="Arial"/>
+              <w:b/>
+              <w:spacing w:val="-10"/>
+              <w:sz w:val="18"/>
+            </w:rPr>
+            <w:t xml:space="preserve"> </w:t>
+          </w:r>
+          <w:r>
+            <w:rPr>
+              <w:rFonts w:ascii="Arial" w:hAnsi="Arial"/>
+              <w:b/>
+              <w:sz w:val="18"/>
+            </w:rPr>
+            <w:t>DE</w:t>
+          </w:r>
+          <w:r>
+            <w:rPr>
+              <w:rFonts w:ascii="Arial" w:hAnsi="Arial"/>
+              <w:b/>
+              <w:spacing w:val="-9"/>
+              <w:sz w:val="18"/>
+            </w:rPr>
+            <w:t xml:space="preserve"> </w:t>
+          </w:r>
+          <w:r>
+            <w:rPr>
+              <w:rFonts w:ascii="Arial" w:hAnsi="Arial"/>
+              <w:b/>
+              <w:sz w:val="18"/>
+            </w:rPr>
+            <w:t>CONTABILIDAD</w:t>
+          </w:r>
+          <w:r>
+            <w:rPr>
+              <w:rFonts w:ascii="Arial" w:hAnsi="Arial"/>
+              <w:b/>
+              <w:spacing w:val="-11"/>
+              <w:sz w:val="18"/>
+            </w:rPr>
+            <w:t xml:space="preserve"> </w:t>
+          </w:r>
+          <w:r>
+            <w:rPr>
+              <w:rFonts w:ascii="Arial" w:hAnsi="Arial"/>
+              <w:b/>
+              <w:sz w:val="18"/>
+            </w:rPr>
+            <w:t>Y</w:t>
+          </w:r>
+        </w:p>
+        <w:p>
+          <w:pPr>
+            <w:pStyle w:val="TableParagraph"/>
+            <w:spacing w:line="204" w:lineRule="exact"/>
+            <w:ind w:left="2068"/>
+            <w:rPr>
+              <w:rFonts w:ascii="Arial" w:hAnsi="Arial"/>
+              <w:b/>
+              <w:sz w:val="18"/>
+            </w:rPr>
+          </w:pPr>
+          <w:r>
+            <w:rPr>
+              <w:rFonts w:ascii="Arial" w:hAnsi="Arial"/>
+              <w:b/>
+              <w:sz w:val="18"/>
+            </w:rPr>
+            <w:t>FINANZAS</w:t>
+          </w:r>
+          <w:r>
+            <w:rPr>
+              <w:rFonts w:ascii="Arial" w:hAnsi="Arial"/>
+              <w:b/>
+              <w:spacing w:val="-4"/>
+              <w:sz w:val="18"/>
+            </w:rPr>
+            <w:t xml:space="preserve"> </w:t>
+          </w:r>
+          <w:r>
+            <w:rPr>
+              <w:rFonts w:ascii="Arial" w:hAnsi="Arial"/>
+              <w:b/>
+              <w:sz w:val="18"/>
+            </w:rPr>
+            <w:t>–</w:t>
+          </w:r>
+          <w:r>
+            <w:rPr>
+              <w:rFonts w:ascii="Arial" w:hAnsi="Arial"/>
+              <w:b/>
+              <w:spacing w:val="-3"/>
+              <w:sz w:val="18"/>
+            </w:rPr>
+            <w:t xml:space="preserve"> </w:t>
+          </w:r>
+          <w:r>
+            <w:rPr>
+              <w:rFonts w:ascii="Arial" w:hAnsi="Arial"/>
+              <w:b/>
+              <w:sz w:val="18"/>
+            </w:rPr>
+            <w:t>2</w:t>
+          </w:r>
+          <w:r>
+            <w:rPr>
+              <w:rFonts w:ascii="Arial" w:hAnsi="Arial"/>
+              <w:b/>
+              <w:spacing w:val="-4"/>
+              <w:sz w:val="18"/>
+            </w:rPr>
+            <w:t xml:space="preserve"> AÑOS</w:t>
+          </w:r>
+        </w:p>
+      </w:tc>
+      <w:tc>
+        <w:tcPr>
+          <w:tcW w:w="1448" w:type="dxa"/>
+        </w:tcPr>
+        <w:p>
+          <w:pPr>
+            <w:pStyle w:val="TableParagraph"/>
+            <w:spacing w:before="172"/>
+            <w:ind w:left="6"/>
+            <w:jc w:val="center"/>
+            <w:rPr>
+              <w:rFonts w:ascii="Arial" w:hAnsi="Arial"/>
+              <w:b/>
+              <w:sz w:val="19"/>
+            </w:rPr>
+          </w:pPr>
+          <w:r>
+            <w:rPr>
+              <w:rFonts w:ascii="Arial" w:hAnsi="Arial"/>
+              <w:b/>
+              <w:spacing w:val="-2"/>
+              <w:sz w:val="19"/>
+            </w:rPr>
+            <w:t>Código:</w:t>
+          </w:r>
+        </w:p>
+      </w:tc>
+      <w:tc>
+        <w:tcPr>
+          <w:tcW w:w="1673" w:type="dxa"/>
+        </w:tcPr>
+        <w:p>
+          <w:pPr>
+            <w:pStyle w:val="TableParagraph"/>
+            <w:spacing w:before="172"/>
+            <w:ind w:left="4"/>
+            <w:jc w:val="center"/>
+            <w:rPr>
+              <w:sz w:val="19"/>
+            </w:rPr>
+          </w:pPr>
+          <w:r>
+            <w:rPr>
+              <w:spacing w:val="-2"/>
+              <w:sz w:val="19"/>
+            </w:rPr>
+            <w:t>FR-VRA-</w:t>
+          </w:r>
+          <w:r>
+            <w:rPr>
+              <w:spacing w:val="-5"/>
+              <w:sz w:val="19"/>
+            </w:rPr>
+            <w:t>166</w:t>
+          </w:r>
+        </w:p>
+      </w:tc>
+    </w:tr>
+    <w:tr>
+      <w:trPr>
+        <w:trHeight w:val="748"/>
+      </w:trPr>
+      <w:tc>
+        <w:tcPr>
+          <w:tcW w:w="1414" w:type="dxa"/>
+          <w:vMerge/>
+          <w:tcBorders>
+            <w:top w:val="nil"/>
+          </w:tcBorders>
+        </w:tcPr>
+        <w:p>
+          <w:pPr>
+            <w:rPr>
+              <w:sz w:val="2"/>
+              <w:szCs w:val="2"/>
+            </w:rPr>
+          </w:pPr>
+        </w:p>
+      </w:tc>
+      <w:tc>
+        <w:tcPr>
+          <w:tcW w:w="5500" w:type="dxa"/>
+          <w:vMerge/>
+          <w:tcBorders>
+            <w:top w:val="nil"/>
+          </w:tcBorders>
+        </w:tcPr>
+        <w:p>
+          <w:pPr>
+            <w:rPr>
+              <w:sz w:val="2"/>
+              <w:szCs w:val="2"/>
+            </w:rPr>
+          </w:pPr>
+        </w:p>
+      </w:tc>
+      <w:tc>
+        <w:tcPr>
+          <w:tcW w:w="1448" w:type="dxa"/>
+        </w:tcPr>
+        <w:p>
+          <w:pPr>
+            <w:pStyle w:val="TableParagraph"/>
+            <w:spacing w:before="47"/>
+            <w:rPr>
+              <w:rFonts w:ascii="Times New Roman"/>
+              <w:sz w:val="19"/>
+            </w:rPr>
+          </w:pPr>
+        </w:p>
+        <w:p>
+          <w:pPr>
+            <w:pStyle w:val="TableParagraph"/>
+            <w:ind w:left="6" w:right="3"/>
+            <w:jc w:val="center"/>
+            <w:rPr>
+              <w:rFonts w:ascii="Arial" w:hAnsi="Arial"/>
+              <w:b/>
+              <w:sz w:val="19"/>
+            </w:rPr>
+          </w:pPr>
+          <w:r>
+            <w:rPr>
+              <w:rFonts w:ascii="Arial" w:hAnsi="Arial"/>
+              <w:b/>
+              <w:spacing w:val="-2"/>
+              <w:sz w:val="19"/>
+            </w:rPr>
+            <w:t>Página:</w:t>
+          </w:r>
+        </w:p>
+      </w:tc>
+      <w:tc>
+        <w:tcPr>
+          <w:tcW w:w="1673" w:type="dxa"/>
+        </w:tcPr>
+        <w:p>
+          <w:pPr>
+            <w:jc w:val="center"/>
+          </w:pPr>
+          <w:r/>
+          <w:r>
+            <w:rPr>
+              <w:b w:val="0"/>
+            </w:rPr>
+            <w:t xml:space="preserve">Página </w:t>
+          </w:r>
+          <w:fldSimple w:instr="PAGE"/>
+          <w:r>
+            <w:t xml:space="preserve"> de 3</w:t>
+          </w:r>
+        </w:p>
+      </w:tc>
+    </w:tr>
+  </w:tbl>
+</w:hdr>
+</file>
+
+<file path=word/header2.xml><?xml version="1.0" encoding="utf-8"?>
+<w:hdr xmlns:m="http://schemas.openxmlformats.org/officeDocument/2006/math" xmlns:mc="http://schemas.openxmlformats.org/markup-compatibility/2006" xmlns:mo="http://schemas.microsoft.com/office/mac/office/2008/main" xmlns:mv="urn:schemas-microsoft-com:mac:vml" xmlns:o="urn:schemas-microsoft-com:office:office" xmlns:r="http://schemas.openxmlformats.org/officeDocument/2006/relationships" xmlns:v="urn:schemas-microsoft-com:vml" xmlns:w10="urn:schemas-microsoft-com:office:word" xmlns:w14="http://schemas.microsoft.com/office/word/2010/wordml" xmlns:w="http://schemas.openxmlformats.org/wordprocessingml/2006/main" xmlns:wne="http://schemas.microsoft.com/office/word/2006/wordml" xmlns:wp14="http://schemas.microsoft.com/office/word/2010/wordprocessingDrawing" xmlns:wp="http://schemas.openxmlformats.org/drawingml/2006/wordprocessingDrawing" xmlns:wpc="http://schemas.microsoft.com/office/word/2010/wordprocessingCanvas" xmlns:wpg="http://schemas.microsoft.com/office/word/2010/wordprocessingGroup" xmlns:wpi="http://schemas.microsoft.com/office/word/2010/wordprocessingInk" xmlns:wps="http://schemas.microsoft.com/office/word/2010/wordprocessingShape" mc:Ignorable="w14 wp14">
+  <w:p>
+    <w:pPr>
+      <w:pStyle w:val="Header"/>
+    </w:pPr>
+  </w:p>
+  <w:tbl>
+    <w:tblPr>
+      <w:tblStyle w:val="TableNormal"/>
+      <w:tblW w:w="0" w:type="auto"/>
+      <w:tblInd w:w="295" w:type="dxa"/>
+      <w:tblBorders>
+        <w:top w:val="single" w:sz="4" w:space="0" w:color="000000"/>
+        <w:left w:val="single" w:sz="4" w:space="0" w:color="000000"/>
+        <w:bottom w:val="single" w:sz="4" w:space="0" w:color="000000"/>
+        <w:right w:val="single" w:sz="4" w:space="0" w:color="000000"/>
+        <w:insideH w:val="single" w:sz="4" w:space="0" w:color="000000"/>
+        <w:insideV w:val="single" w:sz="4" w:space="0" w:color="000000"/>
+      </w:tblBorders>
+      <w:tblLayout w:type="fixed"/>
+      <w:tblLook w:val="01E0" w:firstRow="1" w:lastRow="1" w:firstColumn="1" w:lastColumn="1" w:noHBand="0" w:noVBand="0"/>
+    </w:tblPr>
+    <w:tblGrid>
+      <w:gridCol w:w="1414"/>
+      <w:gridCol w:w="5500"/>
+      <w:gridCol w:w="1448"/>
+      <w:gridCol w:w="1673"/>
+    </w:tblGrid>
+    <w:tr>
+      <w:trPr>
+        <w:trHeight w:val="563"/>
+      </w:trPr>
+      <w:tc>
+        <w:tcPr>
+          <w:tcW w:w="1414" w:type="dxa"/>
+          <w:vMerge w:val="restart"/>
+        </w:tcPr>
+        <w:p>
+          <w:pPr>
+            <w:pStyle w:val="TableParagraph"/>
+            <w:spacing w:before="9"/>
+            <w:rPr>
+              <w:rFonts w:ascii="Times New Roman"/>
+              <w:sz w:val="16"/>
+            </w:rPr>
+          </w:pPr>
+        </w:p>
+        <w:p>
+          <w:pPr>
+            <w:pStyle w:val="TableParagraph"/>
+            <w:ind w:left="277"/>
+            <w:rPr>
+              <w:rFonts w:ascii="Times New Roman"/>
+              <w:sz w:val="20"/>
+            </w:rPr>
+          </w:pPr>
+          <w:r>
+            <w:rPr>
+              <w:rFonts w:ascii="Times New Roman"/>
+              <w:noProof/>
+              <w:sz w:val="20"/>
+            </w:rPr>
+            <w:drawing>
+              <wp:inline distT="0" distB="0" distL="0" distR="0" wp14:anchorId="6440D0DC" wp14:editId="6440D0DD">
+                <wp:extent cx="531994" cy="592074"/>
+                <wp:effectExtent l="0" t="0" r="0" b="0"/>
+                <wp:docPr id="3" name="Image 3"/>
+                <wp:cNvGraphicFramePr>
+                  <a:graphicFrameLocks xmlns:a="http://schemas.openxmlformats.org/drawingml/2006/main"/>
+                </wp:cNvGraphicFramePr>
+                <a:graphic xmlns:a="http://schemas.openxmlformats.org/drawingml/2006/main">
+                  <a:graphicData uri="http://schemas.openxmlformats.org/drawingml/2006/picture">
+                    <pic:pic xmlns:pic="http://schemas.openxmlformats.org/drawingml/2006/picture">
+                      <pic:nvPicPr>
+                        <pic:cNvPr id="3" name="Image 3"/>
+                        <pic:cNvPicPr/>
+                      </pic:nvPicPr>
+                      <pic:blipFill>
+                        <a:blip r:embed="rId1" cstate="print"/>
+                        <a:stretch>
+                          <a:fillRect/>
+                        </a:stretch>
+                      </pic:blipFill>
+                      <pic:spPr>
+                        <a:xfrm>
+                          <a:off x="0" y="0"/>
+                          <a:ext cx="531994" cy="592074"/>
+                        </a:xfrm>
+                        <a:prstGeom prst="rect">
+                          <a:avLst/>
+                        </a:prstGeom>
+                      </pic:spPr>
+                    </pic:pic>
+                  </a:graphicData>
+                </a:graphic>
+              </wp:inline>
+            </w:drawing>
+          </w:r>
+        </w:p>
+      </w:tc>
+      <w:tc>
+        <w:tcPr>
+          <w:tcW w:w="5500" w:type="dxa"/>
+          <w:vMerge w:val="restart"/>
+        </w:tcPr>
+        <w:p>
+          <w:pPr>
+            <w:pStyle w:val="TableParagraph"/>
+            <w:spacing w:before="155"/>
+            <w:ind w:left="1017" w:hanging="27"/>
+            <w:rPr>
+              <w:rFonts w:ascii="Arial"/>
+              <w:b/>
+              <w:sz w:val="19"/>
+            </w:rPr>
+          </w:pPr>
+          <w:r>
+            <w:rPr>
+              <w:rFonts w:ascii="Arial"/>
+              <w:b/>
+              <w:color w:val="890000"/>
+              <w:sz w:val="19"/>
+            </w:rPr>
+            <w:t>UNIVERSIDAD</w:t>
+          </w:r>
+          <w:r>
+            <w:rPr>
+              <w:rFonts w:ascii="Arial"/>
+              <w:b/>
+              <w:color w:val="890000"/>
+              <w:spacing w:val="-9"/>
+              <w:sz w:val="19"/>
+            </w:rPr>
+            <w:t xml:space="preserve"> </w:t>
+          </w:r>
+          <w:r>
+            <w:rPr>
+              <w:rFonts w:ascii="Arial"/>
+              <w:b/>
+              <w:color w:val="890000"/>
+              <w:sz w:val="19"/>
+            </w:rPr>
+            <w:t>PRIVADA</w:t>
+          </w:r>
+          <w:r>
+            <w:rPr>
+              <w:rFonts w:ascii="Arial"/>
+              <w:b/>
+              <w:color w:val="890000"/>
+              <w:spacing w:val="-9"/>
+              <w:sz w:val="19"/>
+            </w:rPr>
+            <w:t xml:space="preserve"> </w:t>
+          </w:r>
+          <w:r>
+            <w:rPr>
+              <w:rFonts w:ascii="Arial"/>
+              <w:b/>
+              <w:color w:val="890000"/>
+              <w:sz w:val="19"/>
+            </w:rPr>
+            <w:t>DE</w:t>
+          </w:r>
+          <w:r>
+            <w:rPr>
+              <w:rFonts w:ascii="Arial"/>
+              <w:b/>
+              <w:color w:val="890000"/>
+              <w:spacing w:val="-8"/>
+              <w:sz w:val="19"/>
+            </w:rPr>
+            <w:t xml:space="preserve"> </w:t>
+          </w:r>
+          <w:r>
+            <w:rPr>
+              <w:rFonts w:ascii="Arial"/>
+              <w:b/>
+              <w:color w:val="890000"/>
+              <w:spacing w:val="-2"/>
+              <w:sz w:val="19"/>
+            </w:rPr>
+            <w:t>TRUJILLO</w:t>
+          </w:r>
+        </w:p>
+        <w:p>
+          <w:pPr>
+            <w:pStyle w:val="TableParagraph"/>
+            <w:spacing w:before="108" w:line="242" w:lineRule="auto"/>
+            <w:ind w:left="704" w:right="133" w:firstLine="312"/>
+            <w:rPr>
+              <w:rFonts w:ascii="Arial" w:hAnsi="Arial"/>
+              <w:b/>
+              <w:sz w:val="18"/>
+            </w:rPr>
+          </w:pPr>
+          <w:r>
+            <w:rPr>
+              <w:rFonts w:ascii="Arial" w:hAnsi="Arial"/>
+              <w:b/>
+              <w:sz w:val="18"/>
+            </w:rPr>
+            <w:t>CONVALIDACIÓN POR COMPETENCIAS CARRERA</w:t>
+          </w:r>
+          <w:r>
+            <w:rPr>
+              <w:rFonts w:ascii="Arial" w:hAnsi="Arial"/>
+              <w:b/>
+              <w:spacing w:val="-11"/>
+              <w:sz w:val="18"/>
+            </w:rPr>
+            <w:t xml:space="preserve"> </w:t>
+          </w:r>
+          <w:r>
+            <w:rPr>
+              <w:rFonts w:ascii="Arial" w:hAnsi="Arial"/>
+              <w:b/>
+              <w:sz w:val="18"/>
+            </w:rPr>
+            <w:t>PROFESIONAL</w:t>
+          </w:r>
+          <w:r>
+            <w:rPr>
+              <w:rFonts w:ascii="Arial" w:hAnsi="Arial"/>
+              <w:b/>
+              <w:spacing w:val="-10"/>
+              <w:sz w:val="18"/>
+            </w:rPr>
+            <w:t xml:space="preserve"> </w:t>
+          </w:r>
+          <w:r>
+            <w:rPr>
+              <w:rFonts w:ascii="Arial" w:hAnsi="Arial"/>
+              <w:b/>
+              <w:sz w:val="18"/>
+            </w:rPr>
+            <w:t>DE</w:t>
+          </w:r>
+          <w:r>
+            <w:rPr>
+              <w:rFonts w:ascii="Arial" w:hAnsi="Arial"/>
+              <w:b/>
+              <w:spacing w:val="-9"/>
+              <w:sz w:val="18"/>
+            </w:rPr>
+            <w:t xml:space="preserve"> </w:t>
+          </w:r>
+          <w:r>
+            <w:rPr>
+              <w:rFonts w:ascii="Arial" w:hAnsi="Arial"/>
+              <w:b/>
+              <w:sz w:val="18"/>
+            </w:rPr>
+            <w:t>CONTABILIDAD</w:t>
+          </w:r>
+          <w:r>
+            <w:rPr>
+              <w:rFonts w:ascii="Arial" w:hAnsi="Arial"/>
+              <w:b/>
+              <w:spacing w:val="-11"/>
+              <w:sz w:val="18"/>
+            </w:rPr>
+            <w:t xml:space="preserve"> </w:t>
+          </w:r>
+          <w:r>
+            <w:rPr>
+              <w:rFonts w:ascii="Arial" w:hAnsi="Arial"/>
+              <w:b/>
+              <w:sz w:val="18"/>
+            </w:rPr>
+            <w:t>Y</w:t>
+          </w:r>
+        </w:p>
+        <w:p>
+          <w:pPr>
+            <w:pStyle w:val="TableParagraph"/>
+            <w:spacing w:line="204" w:lineRule="exact"/>
+            <w:ind w:left="2068"/>
+            <w:rPr>
+              <w:rFonts w:ascii="Arial" w:hAnsi="Arial"/>
+              <w:b/>
+              <w:sz w:val="18"/>
+            </w:rPr>
+          </w:pPr>
+          <w:r>
+            <w:rPr>
+              <w:rFonts w:ascii="Arial" w:hAnsi="Arial"/>
+              <w:b/>
+              <w:sz w:val="18"/>
+            </w:rPr>
+            <w:t>FINANZAS</w:t>
+          </w:r>
+          <w:r>
+            <w:rPr>
+              <w:rFonts w:ascii="Arial" w:hAnsi="Arial"/>
+              <w:b/>
+              <w:spacing w:val="-4"/>
+              <w:sz w:val="18"/>
+            </w:rPr>
+            <w:t xml:space="preserve"> </w:t>
+          </w:r>
+          <w:r>
+            <w:rPr>
+              <w:rFonts w:ascii="Arial" w:hAnsi="Arial"/>
+              <w:b/>
+              <w:sz w:val="18"/>
+            </w:rPr>
+            <w:t>–</w:t>
+          </w:r>
+          <w:r>
+            <w:rPr>
+              <w:rFonts w:ascii="Arial" w:hAnsi="Arial"/>
+              <w:b/>
+              <w:spacing w:val="-3"/>
+              <w:sz w:val="18"/>
+            </w:rPr>
+            <w:t xml:space="preserve"> </w:t>
+          </w:r>
+          <w:r>
+            <w:rPr>
+              <w:rFonts w:ascii="Arial" w:hAnsi="Arial"/>
+              <w:b/>
+              <w:sz w:val="18"/>
+            </w:rPr>
+            <w:t>2</w:t>
+          </w:r>
+          <w:r>
+            <w:rPr>
+              <w:rFonts w:ascii="Arial" w:hAnsi="Arial"/>
+              <w:b/>
+              <w:spacing w:val="-4"/>
+              <w:sz w:val="18"/>
+            </w:rPr>
+            <w:t xml:space="preserve"> AÑOS</w:t>
+          </w:r>
+        </w:p>
+      </w:tc>
+      <w:tc>
+        <w:tcPr>
+          <w:tcW w:w="1448" w:type="dxa"/>
+        </w:tcPr>
+        <w:p>
+          <w:pPr>
+            <w:pStyle w:val="TableParagraph"/>
+            <w:spacing w:before="172"/>
+            <w:ind w:left="6"/>
+            <w:jc w:val="center"/>
+            <w:rPr>
+              <w:rFonts w:ascii="Arial" w:hAnsi="Arial"/>
+              <w:b/>
+              <w:sz w:val="19"/>
+            </w:rPr>
+          </w:pPr>
+          <w:r>
+            <w:rPr>
+              <w:rFonts w:ascii="Arial" w:hAnsi="Arial"/>
+              <w:b/>
+              <w:spacing w:val="-2"/>
+              <w:sz w:val="19"/>
+            </w:rPr>
+            <w:t>Código:</w:t>
+          </w:r>
+        </w:p>
+      </w:tc>
+      <w:tc>
+        <w:tcPr>
+          <w:tcW w:w="1673" w:type="dxa"/>
+        </w:tcPr>
+        <w:p>
+          <w:pPr>
+            <w:pStyle w:val="TableParagraph"/>
+            <w:spacing w:before="172"/>
+            <w:ind w:left="4"/>
+            <w:jc w:val="center"/>
+            <w:rPr>
+              <w:sz w:val="19"/>
+            </w:rPr>
+          </w:pPr>
+          <w:r>
+            <w:rPr>
+              <w:spacing w:val="-2"/>
+              <w:sz w:val="19"/>
+            </w:rPr>
+            <w:t>FR-VRA-</w:t>
+          </w:r>
+          <w:r>
+            <w:rPr>
+              <w:spacing w:val="-5"/>
+              <w:sz w:val="19"/>
+            </w:rPr>
+            <w:t>166</w:t>
+          </w:r>
+        </w:p>
+      </w:tc>
+    </w:tr>
+    <w:tr>
+      <w:trPr>
+        <w:trHeight w:val="748"/>
+      </w:trPr>
+      <w:tc>
+        <w:tcPr>
+          <w:tcW w:w="1414" w:type="dxa"/>
+          <w:vMerge/>
+          <w:tcBorders>
+            <w:top w:val="nil"/>
+          </w:tcBorders>
+        </w:tcPr>
+        <w:p>
+          <w:pPr>
+            <w:rPr>
+              <w:sz w:val="2"/>
+              <w:szCs w:val="2"/>
+            </w:rPr>
+          </w:pPr>
+        </w:p>
+      </w:tc>
+      <w:tc>
+        <w:tcPr>
+          <w:tcW w:w="5500" w:type="dxa"/>
+          <w:vMerge/>
+          <w:tcBorders>
+            <w:top w:val="nil"/>
+          </w:tcBorders>
+        </w:tcPr>
+        <w:p>
+          <w:pPr>
+            <w:rPr>
+              <w:sz w:val="2"/>
+              <w:szCs w:val="2"/>
+            </w:rPr>
+          </w:pPr>
+        </w:p>
+      </w:tc>
+      <w:tc>
+        <w:tcPr>
+          <w:tcW w:w="1448" w:type="dxa"/>
+        </w:tcPr>
+        <w:p>
+          <w:pPr>
+            <w:pStyle w:val="TableParagraph"/>
+            <w:spacing w:before="47"/>
+            <w:rPr>
+              <w:rFonts w:ascii="Times New Roman"/>
+              <w:sz w:val="19"/>
+            </w:rPr>
+          </w:pPr>
+        </w:p>
+        <w:p>
+          <w:pPr>
+            <w:pStyle w:val="TableParagraph"/>
+            <w:ind w:left="6" w:right="3"/>
+            <w:jc w:val="center"/>
+            <w:rPr>
+              <w:rFonts w:ascii="Arial" w:hAnsi="Arial"/>
+              <w:b/>
+              <w:sz w:val="19"/>
+            </w:rPr>
+          </w:pPr>
+          <w:r>
+            <w:rPr>
+              <w:rFonts w:ascii="Arial" w:hAnsi="Arial"/>
+              <w:b/>
+              <w:spacing w:val="-2"/>
+              <w:sz w:val="19"/>
+            </w:rPr>
+            <w:t>Página:</w:t>
+          </w:r>
+        </w:p>
+      </w:tc>
+      <w:tc>
+        <w:tcPr>
+          <w:tcW w:w="1673" w:type="dxa"/>
+        </w:tcPr>
+        <w:p>
+          <w:pPr>
+            <w:jc w:val="center"/>
+          </w:pPr>
+          <w:r/>
+          <w:r>
+            <w:rPr>
+              <w:b w:val="0"/>
+            </w:rPr>
+            <w:t xml:space="preserve">Página </w:t>
+          </w:r>
+          <w:fldSimple w:instr="PAGE"/>
+          <w:r>
+            <w:t xml:space="preserve"> de 3</w:t>
+          </w:r>
+        </w:p>
+      </w:tc>
+    </w:tr>
+  </w:tbl>
+</w:hdr>
 </file>
 
 <file path=word/styles.xml><?xml version="1.0" encoding="utf-8"?>

</xml_diff>